<commit_message>
feat: bedroom-allocation KOB crowding decomposition + presentation figures
Add the Kitagawa-Oaxaca-Blinder pipeline decomposing the 1970->2020 change
in crowding into household-size (numerator) and bedrooms (denominator)
components: import/process, 1970 & 2020 regressions and props, predicted/
counterfactual crowding, cohort bedroom survival, and appendix tables A2/A3.
Also add five-decade-aggregates and presentation figures.

Gitignore bedroom-allocation/throughput and data/bedroom-allocation-kob-db
(~8 GB of .duckdb/.parquet/.rds, regenerable from scripts and too large for
git). Drop households.duckdb from the previous unpushed tip commit for the
same reason.
</commit_message>
<xml_diff>
--- a/household-archetypes/output/tables/fig04-single-mother-rent-burden-regressions.docx
+++ b/household-archetypes/output/tables/fig04-single-mother-rent-burden-regressions.docx
@@ -5,17 +5,18 @@
     <w:tbl>
       <w:tblPr>
         <w:tblStyle w:val="Table"/>
-        <w:tblW w:type="pct" w:w="4780"/>
+        <w:tblW w:type="pct" w:w="4809"/>
         <w:tblLayout w:type="fixed"/>
         <w:tblLook w:firstRow="1" w:lastRow="1" w:firstColumn="0" w:lastColumn="0" w:noHBand="0" w:noVBand="0" w:val="0020"/>
       </w:tblPr>
       <w:tblGrid>
-        <w:gridCol w:w="2349"/>
-        <w:gridCol w:w="1044"/>
-        <w:gridCol w:w="1044"/>
-        <w:gridCol w:w="1044"/>
-        <w:gridCol w:w="1044"/>
-        <w:gridCol w:w="1044"/>
+        <w:gridCol w:w="2901"/>
+        <w:gridCol w:w="785"/>
+        <w:gridCol w:w="785"/>
+        <w:gridCol w:w="785"/>
+        <w:gridCol w:w="785"/>
+        <w:gridCol w:w="785"/>
+        <w:gridCol w:w="785"/>
       </w:tblGrid>
       <w:tr>
         <w:trPr>
@@ -84,6 +85,17 @@
             </w:r>
           </w:p>
         </w:tc>
+        <w:tc>
+          <w:tcPr/>
+          <w:p>
+            <w:pPr>
+              <w:pStyle w:val="Compact"/>
+            </w:pPr>
+            <w:r>
+              <w:t xml:space="preserve">Model 6</w:t>
+            </w:r>
+          </w:p>
+        </w:tc>
       </w:tr>
       <w:tr>
         <w:tc>
@@ -115,40 +127,51 @@
               <w:pStyle w:val="Compact"/>
             </w:pPr>
             <w:r>
-              <w:t xml:space="preserve">0.371***</w:t>
-            </w:r>
-          </w:p>
-        </w:tc>
-        <w:tc>
-          <w:tcPr/>
-          <w:p>
-            <w:pPr>
-              <w:pStyle w:val="Compact"/>
-            </w:pPr>
-            <w:r>
-              <w:t xml:space="preserve">0.387***</w:t>
-            </w:r>
-          </w:p>
-        </w:tc>
-        <w:tc>
-          <w:tcPr/>
-          <w:p>
-            <w:pPr>
-              <w:pStyle w:val="Compact"/>
-            </w:pPr>
-            <w:r>
-              <w:t xml:space="preserve">0.369***</w:t>
-            </w:r>
-          </w:p>
-        </w:tc>
-        <w:tc>
-          <w:tcPr/>
-          <w:p>
-            <w:pPr>
-              <w:pStyle w:val="Compact"/>
-            </w:pPr>
-            <w:r>
-              <w:t xml:space="preserve">0.307***</w:t>
+              <w:t xml:space="preserve">0.370***</w:t>
+            </w:r>
+          </w:p>
+        </w:tc>
+        <w:tc>
+          <w:tcPr/>
+          <w:p>
+            <w:pPr>
+              <w:pStyle w:val="Compact"/>
+            </w:pPr>
+            <w:r>
+              <w:t xml:space="preserve">0.388***</w:t>
+            </w:r>
+          </w:p>
+        </w:tc>
+        <w:tc>
+          <w:tcPr/>
+          <w:p>
+            <w:pPr>
+              <w:pStyle w:val="Compact"/>
+            </w:pPr>
+            <w:r>
+              <w:t xml:space="preserve">0.377***</w:t>
+            </w:r>
+          </w:p>
+        </w:tc>
+        <w:tc>
+          <w:tcPr/>
+          <w:p>
+            <w:pPr>
+              <w:pStyle w:val="Compact"/>
+            </w:pPr>
+            <w:r>
+              <w:t xml:space="preserve">0.304***</w:t>
+            </w:r>
+          </w:p>
+        </w:tc>
+        <w:tc>
+          <w:tcPr/>
+          <w:p>
+            <w:pPr>
+              <w:pStyle w:val="Compact"/>
+            </w:pPr>
+            <w:r>
+              <w:t xml:space="preserve">0.337***</w:t>
             </w:r>
           </w:p>
         </w:tc>
@@ -217,6 +240,17 @@
             </w:r>
           </w:p>
         </w:tc>
+        <w:tc>
+          <w:tcPr/>
+          <w:p>
+            <w:pPr>
+              <w:pStyle w:val="Compact"/>
+            </w:pPr>
+            <w:r>
+              <w:t xml:space="preserve">(0.008)</w:t>
+            </w:r>
+          </w:p>
+        </w:tc>
       </w:tr>
       <w:tr>
         <w:tc>
@@ -237,51 +271,62 @@
               <w:pStyle w:val="Compact"/>
             </w:pPr>
             <w:r>
-              <w:t xml:space="preserve">0.001**</w:t>
-            </w:r>
-          </w:p>
-        </w:tc>
-        <w:tc>
-          <w:tcPr/>
-          <w:p>
-            <w:pPr>
-              <w:pStyle w:val="Compact"/>
-            </w:pPr>
-            <w:r>
-              <w:t xml:space="preserve">0.001**</w:t>
-            </w:r>
-          </w:p>
-        </w:tc>
-        <w:tc>
-          <w:tcPr/>
-          <w:p>
-            <w:pPr>
-              <w:pStyle w:val="Compact"/>
-            </w:pPr>
-            <w:r>
-              <w:t xml:space="preserve">0.002***</w:t>
-            </w:r>
-          </w:p>
-        </w:tc>
-        <w:tc>
-          <w:tcPr/>
-          <w:p>
-            <w:pPr>
-              <w:pStyle w:val="Compact"/>
-            </w:pPr>
-            <w:r>
-              <w:t xml:space="preserve">0.000</w:t>
-            </w:r>
-          </w:p>
-        </w:tc>
-        <w:tc>
-          <w:tcPr/>
-          <w:p>
-            <w:pPr>
-              <w:pStyle w:val="Compact"/>
-            </w:pPr>
-            <w:r>
-              <w:t xml:space="preserve">0.002***</w:t>
+              <w:t xml:space="preserve">0.004***</w:t>
+            </w:r>
+          </w:p>
+        </w:tc>
+        <w:tc>
+          <w:tcPr/>
+          <w:p>
+            <w:pPr>
+              <w:pStyle w:val="Compact"/>
+            </w:pPr>
+            <w:r>
+              <w:t xml:space="preserve">0.004***</w:t>
+            </w:r>
+          </w:p>
+        </w:tc>
+        <w:tc>
+          <w:tcPr/>
+          <w:p>
+            <w:pPr>
+              <w:pStyle w:val="Compact"/>
+            </w:pPr>
+            <w:r>
+              <w:t xml:space="preserve">0.005***</w:t>
+            </w:r>
+          </w:p>
+        </w:tc>
+        <w:tc>
+          <w:tcPr/>
+          <w:p>
+            <w:pPr>
+              <w:pStyle w:val="Compact"/>
+            </w:pPr>
+            <w:r>
+              <w:t xml:space="preserve">0.003***</w:t>
+            </w:r>
+          </w:p>
+        </w:tc>
+        <w:tc>
+          <w:tcPr/>
+          <w:p>
+            <w:pPr>
+              <w:pStyle w:val="Compact"/>
+            </w:pPr>
+            <w:r>
+              <w:t xml:space="preserve">0.006***</w:t>
+            </w:r>
+          </w:p>
+        </w:tc>
+        <w:tc>
+          <w:tcPr/>
+          <w:p>
+            <w:pPr>
+              <w:pStyle w:val="Compact"/>
+            </w:pPr>
+            <w:r>
+              <w:t xml:space="preserve">-0.004+</w:t>
             </w:r>
           </w:p>
         </w:tc>
@@ -350,6 +395,17 @@
             </w:r>
           </w:p>
         </w:tc>
+        <w:tc>
+          <w:tcPr/>
+          <w:p>
+            <w:pPr>
+              <w:pStyle w:val="Compact"/>
+            </w:pPr>
+            <w:r>
+              <w:t xml:space="preserve">(0.002)</w:t>
+            </w:r>
+          </w:p>
+        </w:tc>
       </w:tr>
       <w:tr>
         <w:tc>
@@ -370,51 +426,62 @@
               <w:pStyle w:val="Compact"/>
             </w:pPr>
             <w:r>
-              <w:t xml:space="preserve">0.004</w:t>
-            </w:r>
-          </w:p>
-        </w:tc>
-        <w:tc>
-          <w:tcPr/>
-          <w:p>
-            <w:pPr>
-              <w:pStyle w:val="Compact"/>
-            </w:pPr>
-            <w:r>
-              <w:t xml:space="preserve">0.004</w:t>
-            </w:r>
-          </w:p>
-        </w:tc>
-        <w:tc>
-          <w:tcPr/>
-          <w:p>
-            <w:pPr>
-              <w:pStyle w:val="Compact"/>
-            </w:pPr>
-            <w:r>
-              <w:t xml:space="preserve">0.004</w:t>
-            </w:r>
-          </w:p>
-        </w:tc>
-        <w:tc>
-          <w:tcPr/>
-          <w:p>
-            <w:pPr>
-              <w:pStyle w:val="Compact"/>
-            </w:pPr>
-            <w:r>
-              <w:t xml:space="preserve">0.008*</w:t>
-            </w:r>
-          </w:p>
-        </w:tc>
-        <w:tc>
-          <w:tcPr/>
-          <w:p>
-            <w:pPr>
-              <w:pStyle w:val="Compact"/>
-            </w:pPr>
-            <w:r>
-              <w:t xml:space="preserve">0.011**</w:t>
+              <w:t xml:space="preserve">-0.007*</w:t>
+            </w:r>
+          </w:p>
+        </w:tc>
+        <w:tc>
+          <w:tcPr/>
+          <w:p>
+            <w:pPr>
+              <w:pStyle w:val="Compact"/>
+            </w:pPr>
+            <w:r>
+              <w:t xml:space="preserve">-0.007*</w:t>
+            </w:r>
+          </w:p>
+        </w:tc>
+        <w:tc>
+          <w:tcPr/>
+          <w:p>
+            <w:pPr>
+              <w:pStyle w:val="Compact"/>
+            </w:pPr>
+            <w:r>
+              <w:t xml:space="preserve">-0.006*</w:t>
+            </w:r>
+          </w:p>
+        </w:tc>
+        <w:tc>
+          <w:tcPr/>
+          <w:p>
+            <w:pPr>
+              <w:pStyle w:val="Compact"/>
+            </w:pPr>
+            <w:r>
+              <w:t xml:space="preserve">-0.001</w:t>
+            </w:r>
+          </w:p>
+        </w:tc>
+        <w:tc>
+          <w:tcPr/>
+          <w:p>
+            <w:pPr>
+              <w:pStyle w:val="Compact"/>
+            </w:pPr>
+            <w:r>
+              <w:t xml:space="preserve">0.005</w:t>
+            </w:r>
+          </w:p>
+        </w:tc>
+        <w:tc>
+          <w:tcPr/>
+          <w:p>
+            <w:pPr>
+              <w:pStyle w:val="Compact"/>
+            </w:pPr>
+            <w:r>
+              <w:t xml:space="preserve">-0.020*</w:t>
             </w:r>
           </w:p>
         </w:tc>
@@ -483,6 +550,17 @@
             </w:r>
           </w:p>
         </w:tc>
+        <w:tc>
+          <w:tcPr/>
+          <w:p>
+            <w:pPr>
+              <w:pStyle w:val="Compact"/>
+            </w:pPr>
+            <w:r>
+              <w:t xml:space="preserve">(0.008)</w:t>
+            </w:r>
+          </w:p>
+        </w:tc>
       </w:tr>
       <w:tr>
         <w:tc>
@@ -503,51 +581,62 @@
               <w:pStyle w:val="Compact"/>
             </w:pPr>
             <w:r>
-              <w:t xml:space="preserve">-0.039***</w:t>
-            </w:r>
-          </w:p>
-        </w:tc>
-        <w:tc>
-          <w:tcPr/>
-          <w:p>
-            <w:pPr>
-              <w:pStyle w:val="Compact"/>
-            </w:pPr>
-            <w:r>
-              <w:t xml:space="preserve">-0.040***</w:t>
-            </w:r>
-          </w:p>
-        </w:tc>
-        <w:tc>
-          <w:tcPr/>
-          <w:p>
-            <w:pPr>
-              <w:pStyle w:val="Compact"/>
-            </w:pPr>
-            <w:r>
-              <w:t xml:space="preserve">-0.038***</w:t>
-            </w:r>
-          </w:p>
-        </w:tc>
-        <w:tc>
-          <w:tcPr/>
-          <w:p>
-            <w:pPr>
-              <w:pStyle w:val="Compact"/>
-            </w:pPr>
-            <w:r>
-              <w:t xml:space="preserve">-0.024***</w:t>
-            </w:r>
-          </w:p>
-        </w:tc>
-        <w:tc>
-          <w:tcPr/>
-          <w:p>
-            <w:pPr>
-              <w:pStyle w:val="Compact"/>
-            </w:pPr>
-            <w:r>
-              <w:t xml:space="preserve">-0.013***</w:t>
+              <w:t xml:space="preserve">-0.046***</w:t>
+            </w:r>
+          </w:p>
+        </w:tc>
+        <w:tc>
+          <w:tcPr/>
+          <w:p>
+            <w:pPr>
+              <w:pStyle w:val="Compact"/>
+            </w:pPr>
+            <w:r>
+              <w:t xml:space="preserve">-0.046***</w:t>
+            </w:r>
+          </w:p>
+        </w:tc>
+        <w:tc>
+          <w:tcPr/>
+          <w:p>
+            <w:pPr>
+              <w:pStyle w:val="Compact"/>
+            </w:pPr>
+            <w:r>
+              <w:t xml:space="preserve">-0.044***</w:t>
+            </w:r>
+          </w:p>
+        </w:tc>
+        <w:tc>
+          <w:tcPr/>
+          <w:p>
+            <w:pPr>
+              <w:pStyle w:val="Compact"/>
+            </w:pPr>
+            <w:r>
+              <w:t xml:space="preserve">-0.032***</w:t>
+            </w:r>
+          </w:p>
+        </w:tc>
+        <w:tc>
+          <w:tcPr/>
+          <w:p>
+            <w:pPr>
+              <w:pStyle w:val="Compact"/>
+            </w:pPr>
+            <w:r>
+              <w:t xml:space="preserve">-0.019***</w:t>
+            </w:r>
+          </w:p>
+        </w:tc>
+        <w:tc>
+          <w:tcPr/>
+          <w:p>
+            <w:pPr>
+              <w:pStyle w:val="Compact"/>
+            </w:pPr>
+            <w:r>
+              <w:t xml:space="preserve">-0.056***</w:t>
             </w:r>
           </w:p>
         </w:tc>
@@ -616,6 +705,17 @@
             </w:r>
           </w:p>
         </w:tc>
+        <w:tc>
+          <w:tcPr/>
+          <w:p>
+            <w:pPr>
+              <w:pStyle w:val="Compact"/>
+            </w:pPr>
+            <w:r>
+              <w:t xml:space="preserve">(0.008)</w:t>
+            </w:r>
+          </w:p>
+        </w:tc>
       </w:tr>
       <w:tr>
         <w:tc>
@@ -636,51 +736,62 @@
               <w:pStyle w:val="Compact"/>
             </w:pPr>
             <w:r>
-              <w:t xml:space="preserve">-0.042***</w:t>
-            </w:r>
-          </w:p>
-        </w:tc>
-        <w:tc>
-          <w:tcPr/>
-          <w:p>
-            <w:pPr>
-              <w:pStyle w:val="Compact"/>
-            </w:pPr>
-            <w:r>
-              <w:t xml:space="preserve">-0.044***</w:t>
-            </w:r>
-          </w:p>
-        </w:tc>
-        <w:tc>
-          <w:tcPr/>
-          <w:p>
-            <w:pPr>
-              <w:pStyle w:val="Compact"/>
-            </w:pPr>
-            <w:r>
-              <w:t xml:space="preserve">-0.041***</w:t>
-            </w:r>
-          </w:p>
-        </w:tc>
-        <w:tc>
-          <w:tcPr/>
-          <w:p>
-            <w:pPr>
-              <w:pStyle w:val="Compact"/>
-            </w:pPr>
-            <w:r>
-              <w:t xml:space="preserve">-0.025***</w:t>
-            </w:r>
-          </w:p>
-        </w:tc>
-        <w:tc>
-          <w:tcPr/>
-          <w:p>
-            <w:pPr>
-              <w:pStyle w:val="Compact"/>
-            </w:pPr>
-            <w:r>
-              <w:t xml:space="preserve">-0.009**</w:t>
+              <w:t xml:space="preserve">-0.048***</w:t>
+            </w:r>
+          </w:p>
+        </w:tc>
+        <w:tc>
+          <w:tcPr/>
+          <w:p>
+            <w:pPr>
+              <w:pStyle w:val="Compact"/>
+            </w:pPr>
+            <w:r>
+              <w:t xml:space="preserve">-0.051***</w:t>
+            </w:r>
+          </w:p>
+        </w:tc>
+        <w:tc>
+          <w:tcPr/>
+          <w:p>
+            <w:pPr>
+              <w:pStyle w:val="Compact"/>
+            </w:pPr>
+            <w:r>
+              <w:t xml:space="preserve">-0.047***</w:t>
+            </w:r>
+          </w:p>
+        </w:tc>
+        <w:tc>
+          <w:tcPr/>
+          <w:p>
+            <w:pPr>
+              <w:pStyle w:val="Compact"/>
+            </w:pPr>
+            <w:r>
+              <w:t xml:space="preserve">-0.033***</w:t>
+            </w:r>
+          </w:p>
+        </w:tc>
+        <w:tc>
+          <w:tcPr/>
+          <w:p>
+            <w:pPr>
+              <w:pStyle w:val="Compact"/>
+            </w:pPr>
+            <w:r>
+              <w:t xml:space="preserve">-0.016***</w:t>
+            </w:r>
+          </w:p>
+        </w:tc>
+        <w:tc>
+          <w:tcPr/>
+          <w:p>
+            <w:pPr>
+              <w:pStyle w:val="Compact"/>
+            </w:pPr>
+            <w:r>
+              <w:t xml:space="preserve">-0.049***</w:t>
             </w:r>
           </w:p>
         </w:tc>
@@ -749,6 +860,17 @@
             </w:r>
           </w:p>
         </w:tc>
+        <w:tc>
+          <w:tcPr/>
+          <w:p>
+            <w:pPr>
+              <w:pStyle w:val="Compact"/>
+            </w:pPr>
+            <w:r>
+              <w:t xml:space="preserve">(0.008)</w:t>
+            </w:r>
+          </w:p>
+        </w:tc>
       </w:tr>
       <w:tr>
         <w:tc>
@@ -769,7 +891,18 @@
               <w:pStyle w:val="Compact"/>
             </w:pPr>
             <w:r>
-              <w:t xml:space="preserve">-0.033***</w:t>
+              <w:t xml:space="preserve">-0.037***</w:t>
+            </w:r>
+          </w:p>
+        </w:tc>
+        <w:tc>
+          <w:tcPr/>
+          <w:p>
+            <w:pPr>
+              <w:pStyle w:val="Compact"/>
+            </w:pPr>
+            <w:r>
+              <w:t xml:space="preserve">-0.042***</w:t>
             </w:r>
           </w:p>
         </w:tc>
@@ -791,29 +924,29 @@
               <w:pStyle w:val="Compact"/>
             </w:pPr>
             <w:r>
-              <w:t xml:space="preserve">-0.031***</w:t>
-            </w:r>
-          </w:p>
-        </w:tc>
-        <w:tc>
-          <w:tcPr/>
-          <w:p>
-            <w:pPr>
-              <w:pStyle w:val="Compact"/>
-            </w:pPr>
-            <w:r>
-              <w:t xml:space="preserve">-0.015***</w:t>
-            </w:r>
-          </w:p>
-        </w:tc>
-        <w:tc>
-          <w:tcPr/>
-          <w:p>
-            <w:pPr>
-              <w:pStyle w:val="Compact"/>
-            </w:pPr>
-            <w:r>
-              <w:t xml:space="preserve">-0.002</w:t>
+              <w:t xml:space="preserve">-0.022***</w:t>
+            </w:r>
+          </w:p>
+        </w:tc>
+        <w:tc>
+          <w:tcPr/>
+          <w:p>
+            <w:pPr>
+              <w:pStyle w:val="Compact"/>
+            </w:pPr>
+            <w:r>
+              <w:t xml:space="preserve">-0.007*</w:t>
+            </w:r>
+          </w:p>
+        </w:tc>
+        <w:tc>
+          <w:tcPr/>
+          <w:p>
+            <w:pPr>
+              <w:pStyle w:val="Compact"/>
+            </w:pPr>
+            <w:r>
+              <w:t xml:space="preserve">-0.025**</w:t>
             </w:r>
           </w:p>
         </w:tc>
@@ -882,6 +1015,17 @@
             </w:r>
           </w:p>
         </w:tc>
+        <w:tc>
+          <w:tcPr/>
+          <w:p>
+            <w:pPr>
+              <w:pStyle w:val="Compact"/>
+            </w:pPr>
+            <w:r>
+              <w:t xml:space="preserve">(0.008)</w:t>
+            </w:r>
+          </w:p>
+        </w:tc>
       </w:tr>
       <w:tr>
         <w:tc>
@@ -902,51 +1046,62 @@
               <w:pStyle w:val="Compact"/>
             </w:pPr>
             <w:r>
-              <w:t xml:space="preserve">-0.017***</w:t>
-            </w:r>
-          </w:p>
-        </w:tc>
-        <w:tc>
-          <w:tcPr/>
-          <w:p>
-            <w:pPr>
-              <w:pStyle w:val="Compact"/>
-            </w:pPr>
-            <w:r>
-              <w:t xml:space="preserve">-0.021***</w:t>
-            </w:r>
-          </w:p>
-        </w:tc>
-        <w:tc>
-          <w:tcPr/>
-          <w:p>
-            <w:pPr>
-              <w:pStyle w:val="Compact"/>
-            </w:pPr>
-            <w:r>
-              <w:t xml:space="preserve">-0.015***</w:t>
-            </w:r>
-          </w:p>
-        </w:tc>
-        <w:tc>
-          <w:tcPr/>
-          <w:p>
-            <w:pPr>
-              <w:pStyle w:val="Compact"/>
-            </w:pPr>
-            <w:r>
-              <w:t xml:space="preserve">0.002</w:t>
-            </w:r>
-          </w:p>
-        </w:tc>
-        <w:tc>
-          <w:tcPr/>
-          <w:p>
-            <w:pPr>
-              <w:pStyle w:val="Compact"/>
-            </w:pPr>
-            <w:r>
-              <w:t xml:space="preserve">0.015***</w:t>
+              <w:t xml:space="preserve">-0.025***</w:t>
+            </w:r>
+          </w:p>
+        </w:tc>
+        <w:tc>
+          <w:tcPr/>
+          <w:p>
+            <w:pPr>
+              <w:pStyle w:val="Compact"/>
+            </w:pPr>
+            <w:r>
+              <w:t xml:space="preserve">-0.031***</w:t>
+            </w:r>
+          </w:p>
+        </w:tc>
+        <w:tc>
+          <w:tcPr/>
+          <w:p>
+            <w:pPr>
+              <w:pStyle w:val="Compact"/>
+            </w:pPr>
+            <w:r>
+              <w:t xml:space="preserve">-0.023***</w:t>
+            </w:r>
+          </w:p>
+        </w:tc>
+        <w:tc>
+          <w:tcPr/>
+          <w:p>
+            <w:pPr>
+              <w:pStyle w:val="Compact"/>
+            </w:pPr>
+            <w:r>
+              <w:t xml:space="preserve">-0.008+</w:t>
+            </w:r>
+          </w:p>
+        </w:tc>
+        <w:tc>
+          <w:tcPr/>
+          <w:p>
+            <w:pPr>
+              <w:pStyle w:val="Compact"/>
+            </w:pPr>
+            <w:r>
+              <w:t xml:space="preserve">0.006</w:t>
+            </w:r>
+          </w:p>
+        </w:tc>
+        <w:tc>
+          <w:tcPr/>
+          <w:p>
+            <w:pPr>
+              <w:pStyle w:val="Compact"/>
+            </w:pPr>
+            <w:r>
+              <w:t xml:space="preserve">-0.031**</w:t>
             </w:r>
           </w:p>
         </w:tc>
@@ -1015,6 +1170,17 @@
             </w:r>
           </w:p>
         </w:tc>
+        <w:tc>
+          <w:tcPr/>
+          <w:p>
+            <w:pPr>
+              <w:pStyle w:val="Compact"/>
+            </w:pPr>
+            <w:r>
+              <w:t xml:space="preserve">(0.011)</w:t>
+            </w:r>
+          </w:p>
+        </w:tc>
       </w:tr>
       <w:tr>
         <w:tc>
@@ -1043,40 +1209,51 @@
               <w:pStyle w:val="Compact"/>
             </w:pPr>
             <w:r>
-              <w:t xml:space="preserve">0.006***</w:t>
-            </w:r>
-          </w:p>
-        </w:tc>
-        <w:tc>
-          <w:tcPr/>
-          <w:p>
-            <w:pPr>
-              <w:pStyle w:val="Compact"/>
-            </w:pPr>
-            <w:r>
-              <w:t xml:space="preserve">0.013***</w:t>
-            </w:r>
-          </w:p>
-        </w:tc>
-        <w:tc>
-          <w:tcPr/>
-          <w:p>
-            <w:pPr>
-              <w:pStyle w:val="Compact"/>
-            </w:pPr>
-            <w:r>
-              <w:t xml:space="preserve">0.016***</w:t>
-            </w:r>
-          </w:p>
-        </w:tc>
-        <w:tc>
-          <w:tcPr/>
-          <w:p>
-            <w:pPr>
-              <w:pStyle w:val="Compact"/>
-            </w:pPr>
-            <w:r>
-              <w:t xml:space="preserve">0.019***</w:t>
+              <w:t xml:space="preserve">0.010***</w:t>
+            </w:r>
+          </w:p>
+        </w:tc>
+        <w:tc>
+          <w:tcPr/>
+          <w:p>
+            <w:pPr>
+              <w:pStyle w:val="Compact"/>
+            </w:pPr>
+            <w:r>
+              <w:t xml:space="preserve">0.018***</w:t>
+            </w:r>
+          </w:p>
+        </w:tc>
+        <w:tc>
+          <w:tcPr/>
+          <w:p>
+            <w:pPr>
+              <w:pStyle w:val="Compact"/>
+            </w:pPr>
+            <w:r>
+              <w:t xml:space="preserve">0.018***</w:t>
+            </w:r>
+          </w:p>
+        </w:tc>
+        <w:tc>
+          <w:tcPr/>
+          <w:p>
+            <w:pPr>
+              <w:pStyle w:val="Compact"/>
+            </w:pPr>
+            <w:r>
+              <w:t xml:space="preserve">0.022***</w:t>
+            </w:r>
+          </w:p>
+        </w:tc>
+        <w:tc>
+          <w:tcPr/>
+          <w:p>
+            <w:pPr>
+              <w:pStyle w:val="Compact"/>
+            </w:pPr>
+            <w:r>
+              <w:t xml:space="preserve">0.022***</w:t>
             </w:r>
           </w:p>
         </w:tc>
@@ -1142,6 +1319,17 @@
             </w:r>
           </w:p>
         </w:tc>
+        <w:tc>
+          <w:tcPr/>
+          <w:p>
+            <w:pPr>
+              <w:pStyle w:val="Compact"/>
+            </w:pPr>
+            <w:r>
+              <w:t xml:space="preserve">(0.001)</w:t>
+            </w:r>
+          </w:p>
+        </w:tc>
       </w:tr>
       <w:tr>
         <w:tc>
@@ -1178,18 +1366,29 @@
               <w:pStyle w:val="Compact"/>
             </w:pPr>
             <w:r>
-              <w:t xml:space="preserve">-0.001***</w:t>
-            </w:r>
-          </w:p>
-        </w:tc>
-        <w:tc>
-          <w:tcPr/>
-          <w:p>
-            <w:pPr>
-              <w:pStyle w:val="Compact"/>
-            </w:pPr>
-            <w:r>
-              <w:t xml:space="preserve">-0.001***</w:t>
+              <w:t xml:space="preserve">-0.002***</w:t>
+            </w:r>
+          </w:p>
+        </w:tc>
+        <w:tc>
+          <w:tcPr/>
+          <w:p>
+            <w:pPr>
+              <w:pStyle w:val="Compact"/>
+            </w:pPr>
+            <w:r>
+              <w:t xml:space="preserve">-0.002***</w:t>
+            </w:r>
+          </w:p>
+        </w:tc>
+        <w:tc>
+          <w:tcPr/>
+          <w:p>
+            <w:pPr>
+              <w:pStyle w:val="Compact"/>
+            </w:pPr>
+            <w:r>
+              <w:t xml:space="preserve">-0.002***</w:t>
             </w:r>
           </w:p>
         </w:tc>
@@ -1263,6 +1462,17 @@
             </w:r>
           </w:p>
         </w:tc>
+        <w:tc>
+          <w:tcPr/>
+          <w:p>
+            <w:pPr>
+              <w:pStyle w:val="Compact"/>
+            </w:pPr>
+            <w:r>
+              <w:t xml:space="preserve">(0.000)</w:t>
+            </w:r>
+          </w:p>
+        </w:tc>
       </w:tr>
       <w:tr>
         <w:tc>
@@ -1307,18 +1517,29 @@
               <w:pStyle w:val="Compact"/>
             </w:pPr>
             <w:r>
-              <w:t xml:space="preserve">0.053***</w:t>
-            </w:r>
-          </w:p>
-        </w:tc>
-        <w:tc>
-          <w:tcPr/>
-          <w:p>
-            <w:pPr>
-              <w:pStyle w:val="Compact"/>
-            </w:pPr>
-            <w:r>
-              <w:t xml:space="preserve">0.041***</w:t>
+              <w:t xml:space="preserve">0.048***</w:t>
+            </w:r>
+          </w:p>
+        </w:tc>
+        <w:tc>
+          <w:tcPr/>
+          <w:p>
+            <w:pPr>
+              <w:pStyle w:val="Compact"/>
+            </w:pPr>
+            <w:r>
+              <w:t xml:space="preserve">0.035***</w:t>
+            </w:r>
+          </w:p>
+        </w:tc>
+        <w:tc>
+          <w:tcPr/>
+          <w:p>
+            <w:pPr>
+              <w:pStyle w:val="Compact"/>
+            </w:pPr>
+            <w:r>
+              <w:t xml:space="preserve">0.035***</w:t>
             </w:r>
           </w:p>
         </w:tc>
@@ -1378,6 +1599,17 @@
             </w:r>
           </w:p>
         </w:tc>
+        <w:tc>
+          <w:tcPr/>
+          <w:p>
+            <w:pPr>
+              <w:pStyle w:val="Compact"/>
+            </w:pPr>
+            <w:r>
+              <w:t xml:space="preserve">(0.001)</w:t>
+            </w:r>
+          </w:p>
+        </w:tc>
       </w:tr>
       <w:tr>
         <w:tc>
@@ -1422,18 +1654,29 @@
               <w:pStyle w:val="Compact"/>
             </w:pPr>
             <w:r>
-              <w:t xml:space="preserve">0.033***</w:t>
-            </w:r>
-          </w:p>
-        </w:tc>
-        <w:tc>
-          <w:tcPr/>
-          <w:p>
-            <w:pPr>
-              <w:pStyle w:val="Compact"/>
-            </w:pPr>
-            <w:r>
-              <w:t xml:space="preserve">0.011***</w:t>
+              <w:t xml:space="preserve">0.029***</w:t>
+            </w:r>
+          </w:p>
+        </w:tc>
+        <w:tc>
+          <w:tcPr/>
+          <w:p>
+            <w:pPr>
+              <w:pStyle w:val="Compact"/>
+            </w:pPr>
+            <w:r>
+              <w:t xml:space="preserve">0.007*</w:t>
+            </w:r>
+          </w:p>
+        </w:tc>
+        <w:tc>
+          <w:tcPr/>
+          <w:p>
+            <w:pPr>
+              <w:pStyle w:val="Compact"/>
+            </w:pPr>
+            <w:r>
+              <w:t xml:space="preserve">0.007*</w:t>
             </w:r>
           </w:p>
         </w:tc>
@@ -1478,18 +1721,29 @@
               <w:pStyle w:val="Compact"/>
             </w:pPr>
             <w:r>
-              <w:t xml:space="preserve">(0.002)</w:t>
-            </w:r>
-          </w:p>
-        </w:tc>
-        <w:tc>
-          <w:tcPr/>
-          <w:p>
-            <w:pPr>
-              <w:pStyle w:val="Compact"/>
-            </w:pPr>
-            <w:r>
-              <w:t xml:space="preserve">(0.002)</w:t>
+              <w:t xml:space="preserve">(0.003)</w:t>
+            </w:r>
+          </w:p>
+        </w:tc>
+        <w:tc>
+          <w:tcPr/>
+          <w:p>
+            <w:pPr>
+              <w:pStyle w:val="Compact"/>
+            </w:pPr>
+            <w:r>
+              <w:t xml:space="preserve">(0.003)</w:t>
+            </w:r>
+          </w:p>
+        </w:tc>
+        <w:tc>
+          <w:tcPr/>
+          <w:p>
+            <w:pPr>
+              <w:pStyle w:val="Compact"/>
+            </w:pPr>
+            <w:r>
+              <w:t xml:space="preserve">(0.003)</w:t>
             </w:r>
           </w:p>
         </w:tc>
@@ -1537,18 +1791,29 @@
               <w:pStyle w:val="Compact"/>
             </w:pPr>
             <w:r>
-              <w:t xml:space="preserve">-0.055***</w:t>
-            </w:r>
-          </w:p>
-        </w:tc>
-        <w:tc>
-          <w:tcPr/>
-          <w:p>
-            <w:pPr>
-              <w:pStyle w:val="Compact"/>
-            </w:pPr>
-            <w:r>
-              <w:t xml:space="preserve">-0.051***</w:t>
+              <w:t xml:space="preserve">-0.023***</w:t>
+            </w:r>
+          </w:p>
+        </w:tc>
+        <w:tc>
+          <w:tcPr/>
+          <w:p>
+            <w:pPr>
+              <w:pStyle w:val="Compact"/>
+            </w:pPr>
+            <w:r>
+              <w:t xml:space="preserve">-0.020***</w:t>
+            </w:r>
+          </w:p>
+        </w:tc>
+        <w:tc>
+          <w:tcPr/>
+          <w:p>
+            <w:pPr>
+              <w:pStyle w:val="Compact"/>
+            </w:pPr>
+            <w:r>
+              <w:t xml:space="preserve">-0.020***</w:t>
             </w:r>
           </w:p>
         </w:tc>
@@ -1608,6 +1873,17 @@
             </w:r>
           </w:p>
         </w:tc>
+        <w:tc>
+          <w:tcPr/>
+          <w:p>
+            <w:pPr>
+              <w:pStyle w:val="Compact"/>
+            </w:pPr>
+            <w:r>
+              <w:t xml:space="preserve">(0.003)</w:t>
+            </w:r>
+          </w:p>
+        </w:tc>
       </w:tr>
       <w:tr>
         <w:tc>
@@ -1652,18 +1928,29 @@
               <w:pStyle w:val="Compact"/>
             </w:pPr>
             <w:r>
-              <w:t xml:space="preserve">0.004***</w:t>
-            </w:r>
-          </w:p>
-        </w:tc>
-        <w:tc>
-          <w:tcPr/>
-          <w:p>
-            <w:pPr>
-              <w:pStyle w:val="Compact"/>
-            </w:pPr>
-            <w:r>
-              <w:t xml:space="preserve">0.010***</w:t>
+              <w:t xml:space="preserve">-0.007***</w:t>
+            </w:r>
+          </w:p>
+        </w:tc>
+        <w:tc>
+          <w:tcPr/>
+          <w:p>
+            <w:pPr>
+              <w:pStyle w:val="Compact"/>
+            </w:pPr>
+            <w:r>
+              <w:t xml:space="preserve">-0.000</w:t>
+            </w:r>
+          </w:p>
+        </w:tc>
+        <w:tc>
+          <w:tcPr/>
+          <w:p>
+            <w:pPr>
+              <w:pStyle w:val="Compact"/>
+            </w:pPr>
+            <w:r>
+              <w:t xml:space="preserve">-0.000</w:t>
             </w:r>
           </w:p>
         </w:tc>
@@ -1723,6 +2010,17 @@
             </w:r>
           </w:p>
         </w:tc>
+        <w:tc>
+          <w:tcPr/>
+          <w:p>
+            <w:pPr>
+              <w:pStyle w:val="Compact"/>
+            </w:pPr>
+            <w:r>
+              <w:t xml:space="preserve">(0.001)</w:t>
+            </w:r>
+          </w:p>
+        </w:tc>
       </w:tr>
       <w:tr>
         <w:tc>
@@ -1767,18 +2065,29 @@
               <w:pStyle w:val="Compact"/>
             </w:pPr>
             <w:r>
-              <w:t xml:space="preserve">0.005**</w:t>
-            </w:r>
-          </w:p>
-        </w:tc>
-        <w:tc>
-          <w:tcPr/>
-          <w:p>
-            <w:pPr>
-              <w:pStyle w:val="Compact"/>
-            </w:pPr>
-            <w:r>
-              <w:t xml:space="preserve">0.001</w:t>
+              <w:t xml:space="preserve">0.003</w:t>
+            </w:r>
+          </w:p>
+        </w:tc>
+        <w:tc>
+          <w:tcPr/>
+          <w:p>
+            <w:pPr>
+              <w:pStyle w:val="Compact"/>
+            </w:pPr>
+            <w:r>
+              <w:t xml:space="preserve">-0.001</w:t>
+            </w:r>
+          </w:p>
+        </w:tc>
+        <w:tc>
+          <w:tcPr/>
+          <w:p>
+            <w:pPr>
+              <w:pStyle w:val="Compact"/>
+            </w:pPr>
+            <w:r>
+              <w:t xml:space="preserve">-0.001</w:t>
             </w:r>
           </w:p>
         </w:tc>
@@ -1838,6 +2147,17 @@
             </w:r>
           </w:p>
         </w:tc>
+        <w:tc>
+          <w:tcPr/>
+          <w:p>
+            <w:pPr>
+              <w:pStyle w:val="Compact"/>
+            </w:pPr>
+            <w:r>
+              <w:t xml:space="preserve">(0.002)</w:t>
+            </w:r>
+          </w:p>
+        </w:tc>
       </w:tr>
       <w:tr>
         <w:tc>
@@ -1882,18 +2202,29 @@
               <w:pStyle w:val="Compact"/>
             </w:pPr>
             <w:r>
-              <w:t xml:space="preserve">0.020***</w:t>
-            </w:r>
-          </w:p>
-        </w:tc>
-        <w:tc>
-          <w:tcPr/>
-          <w:p>
-            <w:pPr>
-              <w:pStyle w:val="Compact"/>
-            </w:pPr>
-            <w:r>
-              <w:t xml:space="preserve">0.014***</w:t>
+              <w:t xml:space="preserve">0.018***</w:t>
+            </w:r>
+          </w:p>
+        </w:tc>
+        <w:tc>
+          <w:tcPr/>
+          <w:p>
+            <w:pPr>
+              <w:pStyle w:val="Compact"/>
+            </w:pPr>
+            <w:r>
+              <w:t xml:space="preserve">0.011***</w:t>
+            </w:r>
+          </w:p>
+        </w:tc>
+        <w:tc>
+          <w:tcPr/>
+          <w:p>
+            <w:pPr>
+              <w:pStyle w:val="Compact"/>
+            </w:pPr>
+            <w:r>
+              <w:t xml:space="preserve">0.012***</w:t>
             </w:r>
           </w:p>
         </w:tc>
@@ -1953,6 +2284,17 @@
             </w:r>
           </w:p>
         </w:tc>
+        <w:tc>
+          <w:tcPr/>
+          <w:p>
+            <w:pPr>
+              <w:pStyle w:val="Compact"/>
+            </w:pPr>
+            <w:r>
+              <w:t xml:space="preserve">(0.002)</w:t>
+            </w:r>
+          </w:p>
+        </w:tc>
       </w:tr>
       <w:tr>
         <w:tc>
@@ -1962,62 +2304,58 @@
               <w:pStyle w:val="Compact"/>
             </w:pPr>
             <w:r>
-              <w:t xml:space="preserve">Num.Obs.</w:t>
-            </w:r>
-          </w:p>
-        </w:tc>
-        <w:tc>
-          <w:tcPr/>
-          <w:p>
-            <w:pPr>
-              <w:pStyle w:val="Compact"/>
-            </w:pPr>
-            <w:r>
-              <w:t xml:space="preserve">391190</w:t>
-            </w:r>
-          </w:p>
-        </w:tc>
-        <w:tc>
-          <w:tcPr/>
-          <w:p>
-            <w:pPr>
-              <w:pStyle w:val="Compact"/>
-            </w:pPr>
-            <w:r>
-              <w:t xml:space="preserve">391190</w:t>
-            </w:r>
-          </w:p>
-        </w:tc>
-        <w:tc>
-          <w:tcPr/>
-          <w:p>
-            <w:pPr>
-              <w:pStyle w:val="Compact"/>
-            </w:pPr>
-            <w:r>
-              <w:t xml:space="preserve">391190</w:t>
-            </w:r>
-          </w:p>
-        </w:tc>
-        <w:tc>
-          <w:tcPr/>
-          <w:p>
-            <w:pPr>
-              <w:pStyle w:val="Compact"/>
-            </w:pPr>
-            <w:r>
-              <w:t xml:space="preserve">391190</w:t>
-            </w:r>
-          </w:p>
-        </w:tc>
-        <w:tc>
-          <w:tcPr/>
-          <w:p>
-            <w:pPr>
-              <w:pStyle w:val="Compact"/>
-            </w:pPr>
-            <w:r>
-              <w:t xml:space="preserve">391190</w:t>
+              <w:t xml:space="preserve">decades_since_1970 × factor(bedrooms_recode)1</w:t>
+            </w:r>
+          </w:p>
+        </w:tc>
+        <w:tc>
+          <w:tcPr/>
+          <w:p>
+            <w:pPr>
+              <w:pStyle w:val="Compact"/>
+            </w:pPr>
+          </w:p>
+        </w:tc>
+        <w:tc>
+          <w:tcPr/>
+          <w:p>
+            <w:pPr>
+              <w:pStyle w:val="Compact"/>
+            </w:pPr>
+          </w:p>
+        </w:tc>
+        <w:tc>
+          <w:tcPr/>
+          <w:p>
+            <w:pPr>
+              <w:pStyle w:val="Compact"/>
+            </w:pPr>
+          </w:p>
+        </w:tc>
+        <w:tc>
+          <w:tcPr/>
+          <w:p>
+            <w:pPr>
+              <w:pStyle w:val="Compact"/>
+            </w:pPr>
+          </w:p>
+        </w:tc>
+        <w:tc>
+          <w:tcPr/>
+          <w:p>
+            <w:pPr>
+              <w:pStyle w:val="Compact"/>
+            </w:pPr>
+          </w:p>
+        </w:tc>
+        <w:tc>
+          <w:tcPr/>
+          <w:p>
+            <w:pPr>
+              <w:pStyle w:val="Compact"/>
+            </w:pPr>
+            <w:r>
+              <w:t xml:space="preserve">0.007**</w:t>
             </w:r>
           </w:p>
         </w:tc>
@@ -2029,63 +2367,56 @@
             <w:pPr>
               <w:pStyle w:val="Compact"/>
             </w:pPr>
-            <w:r>
-              <w:t xml:space="preserve">R2</w:t>
-            </w:r>
-          </w:p>
-        </w:tc>
-        <w:tc>
-          <w:tcPr/>
-          <w:p>
-            <w:pPr>
-              <w:pStyle w:val="Compact"/>
-            </w:pPr>
-            <w:r>
-              <w:t xml:space="preserve">0.003</w:t>
-            </w:r>
-          </w:p>
-        </w:tc>
-        <w:tc>
-          <w:tcPr/>
-          <w:p>
-            <w:pPr>
-              <w:pStyle w:val="Compact"/>
-            </w:pPr>
-            <w:r>
-              <w:t xml:space="preserve">0.003</w:t>
-            </w:r>
-          </w:p>
-        </w:tc>
-        <w:tc>
-          <w:tcPr/>
-          <w:p>
-            <w:pPr>
-              <w:pStyle w:val="Compact"/>
-            </w:pPr>
-            <w:r>
-              <w:t xml:space="preserve">0.006</w:t>
-            </w:r>
-          </w:p>
-        </w:tc>
-        <w:tc>
-          <w:tcPr/>
-          <w:p>
-            <w:pPr>
-              <w:pStyle w:val="Compact"/>
-            </w:pPr>
-            <w:r>
-              <w:t xml:space="preserve">0.016</w:t>
-            </w:r>
-          </w:p>
-        </w:tc>
-        <w:tc>
-          <w:tcPr/>
-          <w:p>
-            <w:pPr>
-              <w:pStyle w:val="Compact"/>
-            </w:pPr>
-            <w:r>
-              <w:t xml:space="preserve">0.034</w:t>
+          </w:p>
+        </w:tc>
+        <w:tc>
+          <w:tcPr/>
+          <w:p>
+            <w:pPr>
+              <w:pStyle w:val="Compact"/>
+            </w:pPr>
+          </w:p>
+        </w:tc>
+        <w:tc>
+          <w:tcPr/>
+          <w:p>
+            <w:pPr>
+              <w:pStyle w:val="Compact"/>
+            </w:pPr>
+          </w:p>
+        </w:tc>
+        <w:tc>
+          <w:tcPr/>
+          <w:p>
+            <w:pPr>
+              <w:pStyle w:val="Compact"/>
+            </w:pPr>
+          </w:p>
+        </w:tc>
+        <w:tc>
+          <w:tcPr/>
+          <w:p>
+            <w:pPr>
+              <w:pStyle w:val="Compact"/>
+            </w:pPr>
+          </w:p>
+        </w:tc>
+        <w:tc>
+          <w:tcPr/>
+          <w:p>
+            <w:pPr>
+              <w:pStyle w:val="Compact"/>
+            </w:pPr>
+          </w:p>
+        </w:tc>
+        <w:tc>
+          <w:tcPr/>
+          <w:p>
+            <w:pPr>
+              <w:pStyle w:val="Compact"/>
+            </w:pPr>
+            <w:r>
+              <w:t xml:space="preserve">(0.002)</w:t>
             </w:r>
           </w:p>
         </w:tc>
@@ -2098,62 +2429,58 @@
               <w:pStyle w:val="Compact"/>
             </w:pPr>
             <w:r>
-              <w:t xml:space="preserve">R2 Adj.</w:t>
-            </w:r>
-          </w:p>
-        </w:tc>
-        <w:tc>
-          <w:tcPr/>
-          <w:p>
-            <w:pPr>
-              <w:pStyle w:val="Compact"/>
-            </w:pPr>
-            <w:r>
-              <w:t xml:space="preserve">0.003</w:t>
-            </w:r>
-          </w:p>
-        </w:tc>
-        <w:tc>
-          <w:tcPr/>
-          <w:p>
-            <w:pPr>
-              <w:pStyle w:val="Compact"/>
-            </w:pPr>
-            <w:r>
-              <w:t xml:space="preserve">0.003</w:t>
-            </w:r>
-          </w:p>
-        </w:tc>
-        <w:tc>
-          <w:tcPr/>
-          <w:p>
-            <w:pPr>
-              <w:pStyle w:val="Compact"/>
-            </w:pPr>
-            <w:r>
-              <w:t xml:space="preserve">0.006</w:t>
-            </w:r>
-          </w:p>
-        </w:tc>
-        <w:tc>
-          <w:tcPr/>
-          <w:p>
-            <w:pPr>
-              <w:pStyle w:val="Compact"/>
-            </w:pPr>
-            <w:r>
-              <w:t xml:space="preserve">0.016</w:t>
-            </w:r>
-          </w:p>
-        </w:tc>
-        <w:tc>
-          <w:tcPr/>
-          <w:p>
-            <w:pPr>
-              <w:pStyle w:val="Compact"/>
-            </w:pPr>
-            <w:r>
-              <w:t xml:space="preserve">0.033</w:t>
+              <w:t xml:space="preserve">decades_since_1970 × factor(bedrooms_recode)2</w:t>
+            </w:r>
+          </w:p>
+        </w:tc>
+        <w:tc>
+          <w:tcPr/>
+          <w:p>
+            <w:pPr>
+              <w:pStyle w:val="Compact"/>
+            </w:pPr>
+          </w:p>
+        </w:tc>
+        <w:tc>
+          <w:tcPr/>
+          <w:p>
+            <w:pPr>
+              <w:pStyle w:val="Compact"/>
+            </w:pPr>
+          </w:p>
+        </w:tc>
+        <w:tc>
+          <w:tcPr/>
+          <w:p>
+            <w:pPr>
+              <w:pStyle w:val="Compact"/>
+            </w:pPr>
+          </w:p>
+        </w:tc>
+        <w:tc>
+          <w:tcPr/>
+          <w:p>
+            <w:pPr>
+              <w:pStyle w:val="Compact"/>
+            </w:pPr>
+          </w:p>
+        </w:tc>
+        <w:tc>
+          <w:tcPr/>
+          <w:p>
+            <w:pPr>
+              <w:pStyle w:val="Compact"/>
+            </w:pPr>
+          </w:p>
+        </w:tc>
+        <w:tc>
+          <w:tcPr/>
+          <w:p>
+            <w:pPr>
+              <w:pStyle w:val="Compact"/>
+            </w:pPr>
+            <w:r>
+              <w:t xml:space="preserve">0.011***</w:t>
             </w:r>
           </w:p>
         </w:tc>
@@ -2165,63 +2492,56 @@
             <w:pPr>
               <w:pStyle w:val="Compact"/>
             </w:pPr>
-            <w:r>
-              <w:t xml:space="preserve">AIC</w:t>
-            </w:r>
-          </w:p>
-        </w:tc>
-        <w:tc>
-          <w:tcPr/>
-          <w:p>
-            <w:pPr>
-              <w:pStyle w:val="Compact"/>
-            </w:pPr>
-            <w:r>
-              <w:t xml:space="preserve">-93419.9</w:t>
-            </w:r>
-          </w:p>
-        </w:tc>
-        <w:tc>
-          <w:tcPr/>
-          <w:p>
-            <w:pPr>
-              <w:pStyle w:val="Compact"/>
-            </w:pPr>
-            <w:r>
-              <w:t xml:space="preserve">-93473.2</w:t>
-            </w:r>
-          </w:p>
-        </w:tc>
-        <w:tc>
-          <w:tcPr/>
-          <w:p>
-            <w:pPr>
-              <w:pStyle w:val="Compact"/>
-            </w:pPr>
-            <w:r>
-              <w:t xml:space="preserve">-94524.2</w:t>
-            </w:r>
-          </w:p>
-        </w:tc>
-        <w:tc>
-          <w:tcPr/>
-          <w:p>
-            <w:pPr>
-              <w:pStyle w:val="Compact"/>
-            </w:pPr>
-            <w:r>
-              <w:t xml:space="preserve">-98575.8</w:t>
-            </w:r>
-          </w:p>
-        </w:tc>
-        <w:tc>
-          <w:tcPr/>
-          <w:p>
-            <w:pPr>
-              <w:pStyle w:val="Compact"/>
-            </w:pPr>
-            <w:r>
-              <w:t xml:space="preserve">-105425.2</w:t>
+          </w:p>
+        </w:tc>
+        <w:tc>
+          <w:tcPr/>
+          <w:p>
+            <w:pPr>
+              <w:pStyle w:val="Compact"/>
+            </w:pPr>
+          </w:p>
+        </w:tc>
+        <w:tc>
+          <w:tcPr/>
+          <w:p>
+            <w:pPr>
+              <w:pStyle w:val="Compact"/>
+            </w:pPr>
+          </w:p>
+        </w:tc>
+        <w:tc>
+          <w:tcPr/>
+          <w:p>
+            <w:pPr>
+              <w:pStyle w:val="Compact"/>
+            </w:pPr>
+          </w:p>
+        </w:tc>
+        <w:tc>
+          <w:tcPr/>
+          <w:p>
+            <w:pPr>
+              <w:pStyle w:val="Compact"/>
+            </w:pPr>
+          </w:p>
+        </w:tc>
+        <w:tc>
+          <w:tcPr/>
+          <w:p>
+            <w:pPr>
+              <w:pStyle w:val="Compact"/>
+            </w:pPr>
+          </w:p>
+        </w:tc>
+        <w:tc>
+          <w:tcPr/>
+          <w:p>
+            <w:pPr>
+              <w:pStyle w:val="Compact"/>
+            </w:pPr>
+            <w:r>
+              <w:t xml:space="preserve">(0.002)</w:t>
             </w:r>
           </w:p>
         </w:tc>
@@ -2234,62 +2554,58 @@
               <w:pStyle w:val="Compact"/>
             </w:pPr>
             <w:r>
-              <w:t xml:space="preserve">BIC</w:t>
-            </w:r>
-          </w:p>
-        </w:tc>
-        <w:tc>
-          <w:tcPr/>
-          <w:p>
-            <w:pPr>
-              <w:pStyle w:val="Compact"/>
-            </w:pPr>
-            <w:r>
-              <w:t xml:space="preserve">-93332.9</w:t>
-            </w:r>
-          </w:p>
-        </w:tc>
-        <w:tc>
-          <w:tcPr/>
-          <w:p>
-            <w:pPr>
-              <w:pStyle w:val="Compact"/>
-            </w:pPr>
-            <w:r>
-              <w:t xml:space="preserve">-93375.3</w:t>
-            </w:r>
-          </w:p>
-        </w:tc>
-        <w:tc>
-          <w:tcPr/>
-          <w:p>
-            <w:pPr>
-              <w:pStyle w:val="Compact"/>
-            </w:pPr>
-            <w:r>
-              <w:t xml:space="preserve">-94415.5</w:t>
-            </w:r>
-          </w:p>
-        </w:tc>
-        <w:tc>
-          <w:tcPr/>
-          <w:p>
-            <w:pPr>
-              <w:pStyle w:val="Compact"/>
-            </w:pPr>
-            <w:r>
-              <w:t xml:space="preserve">-98401.8</w:t>
-            </w:r>
-          </w:p>
-        </w:tc>
-        <w:tc>
-          <w:tcPr/>
-          <w:p>
-            <w:pPr>
-              <w:pStyle w:val="Compact"/>
-            </w:pPr>
-            <w:r>
-              <w:t xml:space="preserve">-104696.4</w:t>
+              <w:t xml:space="preserve">decades_since_1970 × factor(bedrooms_recode)3</w:t>
+            </w:r>
+          </w:p>
+        </w:tc>
+        <w:tc>
+          <w:tcPr/>
+          <w:p>
+            <w:pPr>
+              <w:pStyle w:val="Compact"/>
+            </w:pPr>
+          </w:p>
+        </w:tc>
+        <w:tc>
+          <w:tcPr/>
+          <w:p>
+            <w:pPr>
+              <w:pStyle w:val="Compact"/>
+            </w:pPr>
+          </w:p>
+        </w:tc>
+        <w:tc>
+          <w:tcPr/>
+          <w:p>
+            <w:pPr>
+              <w:pStyle w:val="Compact"/>
+            </w:pPr>
+          </w:p>
+        </w:tc>
+        <w:tc>
+          <w:tcPr/>
+          <w:p>
+            <w:pPr>
+              <w:pStyle w:val="Compact"/>
+            </w:pPr>
+          </w:p>
+        </w:tc>
+        <w:tc>
+          <w:tcPr/>
+          <w:p>
+            <w:pPr>
+              <w:pStyle w:val="Compact"/>
+            </w:pPr>
+          </w:p>
+        </w:tc>
+        <w:tc>
+          <w:tcPr/>
+          <w:p>
+            <w:pPr>
+              <w:pStyle w:val="Compact"/>
+            </w:pPr>
+            <w:r>
+              <w:t xml:space="preserve">0.010***</w:t>
             </w:r>
           </w:p>
         </w:tc>
@@ -2301,63 +2617,56 @@
             <w:pPr>
               <w:pStyle w:val="Compact"/>
             </w:pPr>
-            <w:r>
-              <w:t xml:space="preserve">Log.Lik.</w:t>
-            </w:r>
-          </w:p>
-        </w:tc>
-        <w:tc>
-          <w:tcPr/>
-          <w:p>
-            <w:pPr>
-              <w:pStyle w:val="Compact"/>
-            </w:pPr>
-            <w:r>
-              <w:t xml:space="preserve">46717.935</w:t>
-            </w:r>
-          </w:p>
-        </w:tc>
-        <w:tc>
-          <w:tcPr/>
-          <w:p>
-            <w:pPr>
-              <w:pStyle w:val="Compact"/>
-            </w:pPr>
-            <w:r>
-              <w:t xml:space="preserve">46745.598</w:t>
-            </w:r>
-          </w:p>
-        </w:tc>
-        <w:tc>
-          <w:tcPr/>
-          <w:p>
-            <w:pPr>
-              <w:pStyle w:val="Compact"/>
-            </w:pPr>
-            <w:r>
-              <w:t xml:space="preserve">47272.118</w:t>
-            </w:r>
-          </w:p>
-        </w:tc>
-        <w:tc>
-          <w:tcPr/>
-          <w:p>
-            <w:pPr>
-              <w:pStyle w:val="Compact"/>
-            </w:pPr>
-            <w:r>
-              <w:t xml:space="preserve">49303.920</w:t>
-            </w:r>
-          </w:p>
-        </w:tc>
-        <w:tc>
-          <w:tcPr/>
-          <w:p>
-            <w:pPr>
-              <w:pStyle w:val="Compact"/>
-            </w:pPr>
-            <w:r>
-              <w:t xml:space="preserve">52779.597</w:t>
+          </w:p>
+        </w:tc>
+        <w:tc>
+          <w:tcPr/>
+          <w:p>
+            <w:pPr>
+              <w:pStyle w:val="Compact"/>
+            </w:pPr>
+          </w:p>
+        </w:tc>
+        <w:tc>
+          <w:tcPr/>
+          <w:p>
+            <w:pPr>
+              <w:pStyle w:val="Compact"/>
+            </w:pPr>
+          </w:p>
+        </w:tc>
+        <w:tc>
+          <w:tcPr/>
+          <w:p>
+            <w:pPr>
+              <w:pStyle w:val="Compact"/>
+            </w:pPr>
+          </w:p>
+        </w:tc>
+        <w:tc>
+          <w:tcPr/>
+          <w:p>
+            <w:pPr>
+              <w:pStyle w:val="Compact"/>
+            </w:pPr>
+          </w:p>
+        </w:tc>
+        <w:tc>
+          <w:tcPr/>
+          <w:p>
+            <w:pPr>
+              <w:pStyle w:val="Compact"/>
+            </w:pPr>
+          </w:p>
+        </w:tc>
+        <w:tc>
+          <w:tcPr/>
+          <w:p>
+            <w:pPr>
+              <w:pStyle w:val="Compact"/>
+            </w:pPr>
+            <w:r>
+              <w:t xml:space="preserve">(0.002)</w:t>
             </w:r>
           </w:p>
         </w:tc>
@@ -2370,62 +2679,58 @@
               <w:pStyle w:val="Compact"/>
             </w:pPr>
             <w:r>
-              <w:t xml:space="preserve">RMSE</w:t>
-            </w:r>
-          </w:p>
-        </w:tc>
-        <w:tc>
-          <w:tcPr/>
-          <w:p>
-            <w:pPr>
-              <w:pStyle w:val="Compact"/>
-            </w:pPr>
-            <w:r>
-              <w:t xml:space="preserve">0.21</w:t>
-            </w:r>
-          </w:p>
-        </w:tc>
-        <w:tc>
-          <w:tcPr/>
-          <w:p>
-            <w:pPr>
-              <w:pStyle w:val="Compact"/>
-            </w:pPr>
-            <w:r>
-              <w:t xml:space="preserve">0.21</w:t>
-            </w:r>
-          </w:p>
-        </w:tc>
-        <w:tc>
-          <w:tcPr/>
-          <w:p>
-            <w:pPr>
-              <w:pStyle w:val="Compact"/>
-            </w:pPr>
-            <w:r>
-              <w:t xml:space="preserve">0.21</w:t>
-            </w:r>
-          </w:p>
-        </w:tc>
-        <w:tc>
-          <w:tcPr/>
-          <w:p>
-            <w:pPr>
-              <w:pStyle w:val="Compact"/>
-            </w:pPr>
-            <w:r>
-              <w:t xml:space="preserve">0.21</w:t>
-            </w:r>
-          </w:p>
-        </w:tc>
-        <w:tc>
-          <w:tcPr/>
-          <w:p>
-            <w:pPr>
-              <w:pStyle w:val="Compact"/>
-            </w:pPr>
-            <w:r>
-              <w:t xml:space="preserve">0.21</w:t>
+              <w:t xml:space="preserve">decades_since_1970 × factor(bedrooms_recode)4</w:t>
+            </w:r>
+          </w:p>
+        </w:tc>
+        <w:tc>
+          <w:tcPr/>
+          <w:p>
+            <w:pPr>
+              <w:pStyle w:val="Compact"/>
+            </w:pPr>
+          </w:p>
+        </w:tc>
+        <w:tc>
+          <w:tcPr/>
+          <w:p>
+            <w:pPr>
+              <w:pStyle w:val="Compact"/>
+            </w:pPr>
+          </w:p>
+        </w:tc>
+        <w:tc>
+          <w:tcPr/>
+          <w:p>
+            <w:pPr>
+              <w:pStyle w:val="Compact"/>
+            </w:pPr>
+          </w:p>
+        </w:tc>
+        <w:tc>
+          <w:tcPr/>
+          <w:p>
+            <w:pPr>
+              <w:pStyle w:val="Compact"/>
+            </w:pPr>
+          </w:p>
+        </w:tc>
+        <w:tc>
+          <w:tcPr/>
+          <w:p>
+            <w:pPr>
+              <w:pStyle w:val="Compact"/>
+            </w:pPr>
+          </w:p>
+        </w:tc>
+        <w:tc>
+          <w:tcPr/>
+          <w:p>
+            <w:pPr>
+              <w:pStyle w:val="Compact"/>
+            </w:pPr>
+            <w:r>
+              <w:t xml:space="preserve">0.006*</w:t>
             </w:r>
           </w:p>
         </w:tc>
@@ -2437,71 +2742,821 @@
             <w:pPr>
               <w:pStyle w:val="Compact"/>
             </w:pPr>
-            <w:r>
-              <w:t xml:space="preserve">State FE</w:t>
-            </w:r>
-          </w:p>
-        </w:tc>
-        <w:tc>
-          <w:tcPr/>
-          <w:p>
-            <w:pPr>
-              <w:pStyle w:val="Compact"/>
-            </w:pPr>
-            <w:r>
-              <w:t xml:space="preserve">No</w:t>
-            </w:r>
-          </w:p>
-        </w:tc>
-        <w:tc>
-          <w:tcPr/>
-          <w:p>
-            <w:pPr>
-              <w:pStyle w:val="Compact"/>
-            </w:pPr>
-            <w:r>
-              <w:t xml:space="preserve">No</w:t>
-            </w:r>
-          </w:p>
-        </w:tc>
-        <w:tc>
-          <w:tcPr/>
-          <w:p>
-            <w:pPr>
-              <w:pStyle w:val="Compact"/>
-            </w:pPr>
-            <w:r>
-              <w:t xml:space="preserve">No</w:t>
-            </w:r>
-          </w:p>
-        </w:tc>
-        <w:tc>
-          <w:tcPr/>
-          <w:p>
-            <w:pPr>
-              <w:pStyle w:val="Compact"/>
-            </w:pPr>
-            <w:r>
-              <w:t xml:space="preserve">No</w:t>
-            </w:r>
-          </w:p>
-        </w:tc>
-        <w:tc>
-          <w:tcPr/>
-          <w:p>
-            <w:pPr>
-              <w:pStyle w:val="Compact"/>
-            </w:pPr>
-            <w:r>
-              <w:t xml:space="preserve">Yes</w:t>
+          </w:p>
+        </w:tc>
+        <w:tc>
+          <w:tcPr/>
+          <w:p>
+            <w:pPr>
+              <w:pStyle w:val="Compact"/>
+            </w:pPr>
+          </w:p>
+        </w:tc>
+        <w:tc>
+          <w:tcPr/>
+          <w:p>
+            <w:pPr>
+              <w:pStyle w:val="Compact"/>
+            </w:pPr>
+          </w:p>
+        </w:tc>
+        <w:tc>
+          <w:tcPr/>
+          <w:p>
+            <w:pPr>
+              <w:pStyle w:val="Compact"/>
+            </w:pPr>
+          </w:p>
+        </w:tc>
+        <w:tc>
+          <w:tcPr/>
+          <w:p>
+            <w:pPr>
+              <w:pStyle w:val="Compact"/>
+            </w:pPr>
+          </w:p>
+        </w:tc>
+        <w:tc>
+          <w:tcPr/>
+          <w:p>
+            <w:pPr>
+              <w:pStyle w:val="Compact"/>
+            </w:pPr>
+          </w:p>
+        </w:tc>
+        <w:tc>
+          <w:tcPr/>
+          <w:p>
+            <w:pPr>
+              <w:pStyle w:val="Compact"/>
+            </w:pPr>
+            <w:r>
+              <w:t xml:space="preserve">(0.002)</w:t>
             </w:r>
           </w:p>
         </w:tc>
       </w:tr>
       <w:tr>
         <w:tc>
+          <w:tcPr/>
+          <w:p>
+            <w:pPr>
+              <w:pStyle w:val="Compact"/>
+            </w:pPr>
+            <w:r>
+              <w:t xml:space="preserve">decades_since_1970 × factor(bedrooms_recode)5</w:t>
+            </w:r>
+          </w:p>
+        </w:tc>
+        <w:tc>
+          <w:tcPr/>
+          <w:p>
+            <w:pPr>
+              <w:pStyle w:val="Compact"/>
+            </w:pPr>
+          </w:p>
+        </w:tc>
+        <w:tc>
+          <w:tcPr/>
+          <w:p>
+            <w:pPr>
+              <w:pStyle w:val="Compact"/>
+            </w:pPr>
+          </w:p>
+        </w:tc>
+        <w:tc>
+          <w:tcPr/>
+          <w:p>
+            <w:pPr>
+              <w:pStyle w:val="Compact"/>
+            </w:pPr>
+          </w:p>
+        </w:tc>
+        <w:tc>
+          <w:tcPr/>
+          <w:p>
+            <w:pPr>
+              <w:pStyle w:val="Compact"/>
+            </w:pPr>
+          </w:p>
+        </w:tc>
+        <w:tc>
+          <w:tcPr/>
+          <w:p>
+            <w:pPr>
+              <w:pStyle w:val="Compact"/>
+            </w:pPr>
+          </w:p>
+        </w:tc>
+        <w:tc>
+          <w:tcPr/>
+          <w:p>
+            <w:pPr>
+              <w:pStyle w:val="Compact"/>
+            </w:pPr>
+            <w:r>
+              <w:t xml:space="preserve">0.011***</w:t>
+            </w:r>
+          </w:p>
+        </w:tc>
+      </w:tr>
+      <w:tr>
+        <w:tc>
+          <w:tcPr/>
+          <w:p>
+            <w:pPr>
+              <w:pStyle w:val="Compact"/>
+            </w:pPr>
+          </w:p>
+        </w:tc>
+        <w:tc>
+          <w:tcPr/>
+          <w:p>
+            <w:pPr>
+              <w:pStyle w:val="Compact"/>
+            </w:pPr>
+          </w:p>
+        </w:tc>
+        <w:tc>
+          <w:tcPr/>
+          <w:p>
+            <w:pPr>
+              <w:pStyle w:val="Compact"/>
+            </w:pPr>
+          </w:p>
+        </w:tc>
+        <w:tc>
+          <w:tcPr/>
+          <w:p>
+            <w:pPr>
+              <w:pStyle w:val="Compact"/>
+            </w:pPr>
+          </w:p>
+        </w:tc>
+        <w:tc>
+          <w:tcPr/>
+          <w:p>
+            <w:pPr>
+              <w:pStyle w:val="Compact"/>
+            </w:pPr>
+          </w:p>
+        </w:tc>
+        <w:tc>
+          <w:tcPr/>
+          <w:p>
+            <w:pPr>
+              <w:pStyle w:val="Compact"/>
+            </w:pPr>
+          </w:p>
+        </w:tc>
+        <w:tc>
+          <w:tcPr/>
+          <w:p>
+            <w:pPr>
+              <w:pStyle w:val="Compact"/>
+            </w:pPr>
+            <w:r>
+              <w:t xml:space="preserve">(0.003)</w:t>
+            </w:r>
+          </w:p>
+        </w:tc>
+      </w:tr>
+      <w:tr>
+        <w:tc>
+          <w:tcPr/>
+          <w:p>
+            <w:pPr>
+              <w:pStyle w:val="Compact"/>
+            </w:pPr>
+            <w:r>
+              <w:t xml:space="preserve">Num.Obs.</w:t>
+            </w:r>
+          </w:p>
+        </w:tc>
+        <w:tc>
+          <w:tcPr/>
+          <w:p>
+            <w:pPr>
+              <w:pStyle w:val="Compact"/>
+            </w:pPr>
+            <w:r>
+              <w:t xml:space="preserve">391187</w:t>
+            </w:r>
+          </w:p>
+        </w:tc>
+        <w:tc>
+          <w:tcPr/>
+          <w:p>
+            <w:pPr>
+              <w:pStyle w:val="Compact"/>
+            </w:pPr>
+            <w:r>
+              <w:t xml:space="preserve">391187</w:t>
+            </w:r>
+          </w:p>
+        </w:tc>
+        <w:tc>
+          <w:tcPr/>
+          <w:p>
+            <w:pPr>
+              <w:pStyle w:val="Compact"/>
+            </w:pPr>
+            <w:r>
+              <w:t xml:space="preserve">391187</w:t>
+            </w:r>
+          </w:p>
+        </w:tc>
+        <w:tc>
+          <w:tcPr/>
+          <w:p>
+            <w:pPr>
+              <w:pStyle w:val="Compact"/>
+            </w:pPr>
+            <w:r>
+              <w:t xml:space="preserve">391187</w:t>
+            </w:r>
+          </w:p>
+        </w:tc>
+        <w:tc>
+          <w:tcPr/>
+          <w:p>
+            <w:pPr>
+              <w:pStyle w:val="Compact"/>
+            </w:pPr>
+            <w:r>
+              <w:t xml:space="preserve">391187</w:t>
+            </w:r>
+          </w:p>
+        </w:tc>
+        <w:tc>
+          <w:tcPr/>
+          <w:p>
+            <w:pPr>
+              <w:pStyle w:val="Compact"/>
+            </w:pPr>
+            <w:r>
+              <w:t xml:space="preserve">391187</w:t>
+            </w:r>
+          </w:p>
+        </w:tc>
+      </w:tr>
+      <w:tr>
+        <w:tc>
+          <w:tcPr/>
+          <w:p>
+            <w:pPr>
+              <w:pStyle w:val="Compact"/>
+            </w:pPr>
+            <w:r>
+              <w:t xml:space="preserve">R2</w:t>
+            </w:r>
+          </w:p>
+        </w:tc>
+        <w:tc>
+          <w:tcPr/>
+          <w:p>
+            <w:pPr>
+              <w:pStyle w:val="Compact"/>
+            </w:pPr>
+            <w:r>
+              <w:t xml:space="preserve">0.004</w:t>
+            </w:r>
+          </w:p>
+        </w:tc>
+        <w:tc>
+          <w:tcPr/>
+          <w:p>
+            <w:pPr>
+              <w:pStyle w:val="Compact"/>
+            </w:pPr>
+            <w:r>
+              <w:t xml:space="preserve">0.004</w:t>
+            </w:r>
+          </w:p>
+        </w:tc>
+        <w:tc>
+          <w:tcPr/>
+          <w:p>
+            <w:pPr>
+              <w:pStyle w:val="Compact"/>
+            </w:pPr>
+            <w:r>
+              <w:t xml:space="preserve">0.008</w:t>
+            </w:r>
+          </w:p>
+        </w:tc>
+        <w:tc>
+          <w:tcPr/>
+          <w:p>
+            <w:pPr>
+              <w:pStyle w:val="Compact"/>
+            </w:pPr>
+            <w:r>
+              <w:t xml:space="preserve">0.016</w:t>
+            </w:r>
+          </w:p>
+        </w:tc>
+        <w:tc>
+          <w:tcPr/>
+          <w:p>
+            <w:pPr>
+              <w:pStyle w:val="Compact"/>
+            </w:pPr>
+            <w:r>
+              <w:t xml:space="preserve">0.035</w:t>
+            </w:r>
+          </w:p>
+        </w:tc>
+        <w:tc>
+          <w:tcPr/>
+          <w:p>
+            <w:pPr>
+              <w:pStyle w:val="Compact"/>
+            </w:pPr>
+            <w:r>
+              <w:t xml:space="preserve">0.035</w:t>
+            </w:r>
+          </w:p>
+        </w:tc>
+      </w:tr>
+      <w:tr>
+        <w:tc>
+          <w:tcPr/>
+          <w:p>
+            <w:pPr>
+              <w:pStyle w:val="Compact"/>
+            </w:pPr>
+            <w:r>
+              <w:t xml:space="preserve">R2 Adj.</w:t>
+            </w:r>
+          </w:p>
+        </w:tc>
+        <w:tc>
+          <w:tcPr/>
+          <w:p>
+            <w:pPr>
+              <w:pStyle w:val="Compact"/>
+            </w:pPr>
+            <w:r>
+              <w:t xml:space="preserve">0.004</w:t>
+            </w:r>
+          </w:p>
+        </w:tc>
+        <w:tc>
+          <w:tcPr/>
+          <w:p>
+            <w:pPr>
+              <w:pStyle w:val="Compact"/>
+            </w:pPr>
+            <w:r>
+              <w:t xml:space="preserve">0.004</w:t>
+            </w:r>
+          </w:p>
+        </w:tc>
+        <w:tc>
+          <w:tcPr/>
+          <w:p>
+            <w:pPr>
+              <w:pStyle w:val="Compact"/>
+            </w:pPr>
+            <w:r>
+              <w:t xml:space="preserve">0.008</w:t>
+            </w:r>
+          </w:p>
+        </w:tc>
+        <w:tc>
+          <w:tcPr/>
+          <w:p>
+            <w:pPr>
+              <w:pStyle w:val="Compact"/>
+            </w:pPr>
+            <w:r>
+              <w:t xml:space="preserve">0.016</w:t>
+            </w:r>
+          </w:p>
+        </w:tc>
+        <w:tc>
+          <w:tcPr/>
+          <w:p>
+            <w:pPr>
+              <w:pStyle w:val="Compact"/>
+            </w:pPr>
+            <w:r>
+              <w:t xml:space="preserve">0.035</w:t>
+            </w:r>
+          </w:p>
+        </w:tc>
+        <w:tc>
+          <w:tcPr/>
+          <w:p>
+            <w:pPr>
+              <w:pStyle w:val="Compact"/>
+            </w:pPr>
+            <w:r>
+              <w:t xml:space="preserve">0.035</w:t>
+            </w:r>
+          </w:p>
+        </w:tc>
+      </w:tr>
+      <w:tr>
+        <w:tc>
+          <w:tcPr/>
+          <w:p>
+            <w:pPr>
+              <w:pStyle w:val="Compact"/>
+            </w:pPr>
+            <w:r>
+              <w:t xml:space="preserve">AIC</w:t>
+            </w:r>
+          </w:p>
+        </w:tc>
+        <w:tc>
+          <w:tcPr/>
+          <w:p>
+            <w:pPr>
+              <w:pStyle w:val="Compact"/>
+            </w:pPr>
+            <w:r>
+              <w:t xml:space="preserve">86542.2</w:t>
+            </w:r>
+          </w:p>
+        </w:tc>
+        <w:tc>
+          <w:tcPr/>
+          <w:p>
+            <w:pPr>
+              <w:pStyle w:val="Compact"/>
+            </w:pPr>
+            <w:r>
+              <w:t xml:space="preserve">86423.2</w:t>
+            </w:r>
+          </w:p>
+        </w:tc>
+        <w:tc>
+          <w:tcPr/>
+          <w:p>
+            <w:pPr>
+              <w:pStyle w:val="Compact"/>
+            </w:pPr>
+            <w:r>
+              <w:t xml:space="preserve">85080.7</w:t>
+            </w:r>
+          </w:p>
+        </w:tc>
+        <w:tc>
+          <w:tcPr/>
+          <w:p>
+            <w:pPr>
+              <w:pStyle w:val="Compact"/>
+            </w:pPr>
+            <w:r>
+              <w:t xml:space="preserve">81826.0</w:t>
+            </w:r>
+          </w:p>
+        </w:tc>
+        <w:tc>
+          <w:tcPr/>
+          <w:p>
+            <w:pPr>
+              <w:pStyle w:val="Compact"/>
+            </w:pPr>
+            <w:r>
+              <w:t xml:space="preserve">74241.6</w:t>
+            </w:r>
+          </w:p>
+        </w:tc>
+        <w:tc>
+          <w:tcPr/>
+          <w:p>
+            <w:pPr>
+              <w:pStyle w:val="Compact"/>
+            </w:pPr>
+            <w:r>
+              <w:t xml:space="preserve">74180.9</w:t>
+            </w:r>
+          </w:p>
+        </w:tc>
+      </w:tr>
+      <w:tr>
+        <w:tc>
+          <w:tcPr/>
+          <w:p>
+            <w:pPr>
+              <w:pStyle w:val="Compact"/>
+            </w:pPr>
+            <w:r>
+              <w:t xml:space="preserve">BIC</w:t>
+            </w:r>
+          </w:p>
+        </w:tc>
+        <w:tc>
+          <w:tcPr/>
+          <w:p>
+            <w:pPr>
+              <w:pStyle w:val="Compact"/>
+            </w:pPr>
+            <w:r>
+              <w:t xml:space="preserve">86629.2</w:t>
+            </w:r>
+          </w:p>
+        </w:tc>
+        <w:tc>
+          <w:tcPr/>
+          <w:p>
+            <w:pPr>
+              <w:pStyle w:val="Compact"/>
+            </w:pPr>
+            <w:r>
+              <w:t xml:space="preserve">86521.1</w:t>
+            </w:r>
+          </w:p>
+        </w:tc>
+        <w:tc>
+          <w:tcPr/>
+          <w:p>
+            <w:pPr>
+              <w:pStyle w:val="Compact"/>
+            </w:pPr>
+            <w:r>
+              <w:t xml:space="preserve">85189.4</w:t>
+            </w:r>
+          </w:p>
+        </w:tc>
+        <w:tc>
+          <w:tcPr/>
+          <w:p>
+            <w:pPr>
+              <w:pStyle w:val="Compact"/>
+            </w:pPr>
+            <w:r>
+              <w:t xml:space="preserve">82000.0</w:t>
+            </w:r>
+          </w:p>
+        </w:tc>
+        <w:tc>
+          <w:tcPr/>
+          <w:p>
+            <w:pPr>
+              <w:pStyle w:val="Compact"/>
+            </w:pPr>
+            <w:r>
+              <w:t xml:space="preserve">74970.3</w:t>
+            </w:r>
+          </w:p>
+        </w:tc>
+        <w:tc>
+          <w:tcPr/>
+          <w:p>
+            <w:pPr>
+              <w:pStyle w:val="Compact"/>
+            </w:pPr>
+            <w:r>
+              <w:t xml:space="preserve">74964.0</w:t>
+            </w:r>
+          </w:p>
+        </w:tc>
+      </w:tr>
+      <w:tr>
+        <w:tc>
+          <w:tcPr/>
+          <w:p>
+            <w:pPr>
+              <w:pStyle w:val="Compact"/>
+            </w:pPr>
+            <w:r>
+              <w:t xml:space="preserve">Log.Lik.</w:t>
+            </w:r>
+          </w:p>
+        </w:tc>
+        <w:tc>
+          <w:tcPr/>
+          <w:p>
+            <w:pPr>
+              <w:pStyle w:val="Compact"/>
+            </w:pPr>
+            <w:r>
+              <w:t xml:space="preserve">-43263.078</w:t>
+            </w:r>
+          </w:p>
+        </w:tc>
+        <w:tc>
+          <w:tcPr/>
+          <w:p>
+            <w:pPr>
+              <w:pStyle w:val="Compact"/>
+            </w:pPr>
+            <w:r>
+              <w:t xml:space="preserve">-43202.587</w:t>
+            </w:r>
+          </w:p>
+        </w:tc>
+        <w:tc>
+          <w:tcPr/>
+          <w:p>
+            <w:pPr>
+              <w:pStyle w:val="Compact"/>
+            </w:pPr>
+            <w:r>
+              <w:t xml:space="preserve">-42530.335</w:t>
+            </w:r>
+          </w:p>
+        </w:tc>
+        <w:tc>
+          <w:tcPr/>
+          <w:p>
+            <w:pPr>
+              <w:pStyle w:val="Compact"/>
+            </w:pPr>
+            <w:r>
+              <w:t xml:space="preserve">-40896.981</w:t>
+            </w:r>
+          </w:p>
+        </w:tc>
+        <w:tc>
+          <w:tcPr/>
+          <w:p>
+            <w:pPr>
+              <w:pStyle w:val="Compact"/>
+            </w:pPr>
+            <w:r>
+              <w:t xml:space="preserve">-37053.776</w:t>
+            </w:r>
+          </w:p>
+        </w:tc>
+        <w:tc>
+          <w:tcPr/>
+          <w:p>
+            <w:pPr>
+              <w:pStyle w:val="Compact"/>
+            </w:pPr>
+            <w:r>
+              <w:t xml:space="preserve">-37018.447</w:t>
+            </w:r>
+          </w:p>
+        </w:tc>
+      </w:tr>
+      <w:tr>
+        <w:tc>
+          <w:tcPr/>
+          <w:p>
+            <w:pPr>
+              <w:pStyle w:val="Compact"/>
+            </w:pPr>
+            <w:r>
+              <w:t xml:space="preserve">RMSE</w:t>
+            </w:r>
+          </w:p>
+        </w:tc>
+        <w:tc>
+          <w:tcPr/>
+          <w:p>
+            <w:pPr>
+              <w:pStyle w:val="Compact"/>
+            </w:pPr>
+            <w:r>
+              <w:t xml:space="preserve">0.21</w:t>
+            </w:r>
+          </w:p>
+        </w:tc>
+        <w:tc>
+          <w:tcPr/>
+          <w:p>
+            <w:pPr>
+              <w:pStyle w:val="Compact"/>
+            </w:pPr>
+            <w:r>
+              <w:t xml:space="preserve">0.21</w:t>
+            </w:r>
+          </w:p>
+        </w:tc>
+        <w:tc>
+          <w:tcPr/>
+          <w:p>
+            <w:pPr>
+              <w:pStyle w:val="Compact"/>
+            </w:pPr>
+            <w:r>
+              <w:t xml:space="preserve">0.21</w:t>
+            </w:r>
+          </w:p>
+        </w:tc>
+        <w:tc>
+          <w:tcPr/>
+          <w:p>
+            <w:pPr>
+              <w:pStyle w:val="Compact"/>
+            </w:pPr>
+            <w:r>
+              <w:t xml:space="preserve">0.21</w:t>
+            </w:r>
+          </w:p>
+        </w:tc>
+        <w:tc>
+          <w:tcPr/>
+          <w:p>
+            <w:pPr>
+              <w:pStyle w:val="Compact"/>
+            </w:pPr>
+            <w:r>
+              <w:t xml:space="preserve">0.21</w:t>
+            </w:r>
+          </w:p>
+        </w:tc>
+        <w:tc>
+          <w:tcPr/>
+          <w:p>
+            <w:pPr>
+              <w:pStyle w:val="Compact"/>
+            </w:pPr>
+            <w:r>
+              <w:t xml:space="preserve">0.21</w:t>
+            </w:r>
+          </w:p>
+        </w:tc>
+      </w:tr>
+      <w:tr>
+        <w:tc>
+          <w:tcPr/>
+          <w:p>
+            <w:pPr>
+              <w:pStyle w:val="Compact"/>
+            </w:pPr>
+            <w:r>
+              <w:t xml:space="preserve">State FE</w:t>
+            </w:r>
+          </w:p>
+        </w:tc>
+        <w:tc>
+          <w:tcPr/>
+          <w:p>
+            <w:pPr>
+              <w:pStyle w:val="Compact"/>
+            </w:pPr>
+            <w:r>
+              <w:t xml:space="preserve">No</w:t>
+            </w:r>
+          </w:p>
+        </w:tc>
+        <w:tc>
+          <w:tcPr/>
+          <w:p>
+            <w:pPr>
+              <w:pStyle w:val="Compact"/>
+            </w:pPr>
+            <w:r>
+              <w:t xml:space="preserve">No</w:t>
+            </w:r>
+          </w:p>
+        </w:tc>
+        <w:tc>
+          <w:tcPr/>
+          <w:p>
+            <w:pPr>
+              <w:pStyle w:val="Compact"/>
+            </w:pPr>
+            <w:r>
+              <w:t xml:space="preserve">No</w:t>
+            </w:r>
+          </w:p>
+        </w:tc>
+        <w:tc>
+          <w:tcPr/>
+          <w:p>
+            <w:pPr>
+              <w:pStyle w:val="Compact"/>
+            </w:pPr>
+            <w:r>
+              <w:t xml:space="preserve">No</w:t>
+            </w:r>
+          </w:p>
+        </w:tc>
+        <w:tc>
+          <w:tcPr/>
+          <w:p>
+            <w:pPr>
+              <w:pStyle w:val="Compact"/>
+            </w:pPr>
+            <w:r>
+              <w:t xml:space="preserve">Yes</w:t>
+            </w:r>
+          </w:p>
+        </w:tc>
+        <w:tc>
+          <w:tcPr/>
+          <w:p>
+            <w:pPr>
+              <w:pStyle w:val="Compact"/>
+            </w:pPr>
+            <w:r>
+              <w:t xml:space="preserve">Yes</w:t>
+            </w:r>
+          </w:p>
+        </w:tc>
+      </w:tr>
+      <w:tr>
+        <w:tc>
           <w:tcPr>
-            <w:gridSpan w:val="6"/>
+            <w:gridSpan w:val="7"/>
           </w:tcPr>
           <w:p>
             <w:pPr>

</xml_diff>